<commit_message>
Add signed cover letter and portal metadata
</commit_message>
<xml_diff>
--- a/manuscript/cover_letter_presubmission_v2.docx
+++ b/manuscript/cover_letter_presubmission_v2.docx
@@ -290,7 +290,19 @@
           <w:rFonts w:ascii="Arial" w:hAnsi="Arial"/>
           <w:sz w:val="21"/>
         </w:rPr>
-        <w:t>Yiming Zuo</w:t>
+        <w:t xml:space="preserve">Yiming Zuo  </w:t>
+      </w:r>
+    </w:p>
+    <w:p>
+      <w:pPr>
+        <w:spacing w:after="100" w:line="259" w:lineRule="auto"/>
+      </w:pPr>
+      <w:r>
+        <w:rPr>
+          <w:rFonts w:ascii="Arial" w:hAnsi="Arial"/>
+          <w:sz w:val="21"/>
+        </w:rPr>
+        <w:t>Electronically signed by the corresponding author</w:t>
       </w:r>
     </w:p>
     <w:sectPr>

</xml_diff>